<commit_message>
rapor ozben hocaya gonderilmeye hazir
</commit_message>
<xml_diff>
--- a/tik5/OrhunUzdiyem_tik5.docx
+++ b/tik5/OrhunUzdiyem_tik5.docx
@@ -1054,10 +1054,7 @@
         <w:t>Figür 1.</w:t>
       </w:r>
       <w:r>
-        <w:t xml:space="preserve"> </w:t>
-      </w:r>
-      <w:r>
-        <w:t xml:space="preserve">Ters ML destekli optimizasyon ve MPC genel sistem mimarisi  </w:t>
+        <w:t xml:space="preserve"> Ters ML destekli optimizasyon ve MPC genel sistem mimarisi  </w:t>
       </w:r>
     </w:p>
     <w:p>
@@ -1066,7 +1063,13 @@
         <w:jc w:val="both"/>
       </w:pPr>
       <w:r>
-        <w:t>Bu dönemde yapılan çalışma dört ana aşamada yürütülmüştür. İlk aşamada, mevcut ters makine öğrenmesi modeli kullanıma hazır bir tahmin arayüzüne dönüştürülmüştür. İkinci aşamada, modelin genelleme kabiliyetini daha gerçekçi biçimde değerlendirmek için BiooilID bazlı ek validasyon yapılmıştır. Üçüncü aşamada, optimizasyon ve MPC hesaplamalarında Cantera simülasyonlarını tekrar tekrar çalıştırmak yerine hızlı sonuç verebilecek ileri bir surrogate model geliştirilmiştir. Son aşamada ise statik optimizasyon ve basit bir MPC senaryosu oluşturularak sistemin farklı biyoyağ kompozisyonları ve bozucu etkiler altında nasıl davrandığı incelenmiştir.</w:t>
+        <w:t xml:space="preserve">Bu dönemde yapılan çalışma </w:t>
+      </w:r>
+      <w:r>
+        <w:t>üç</w:t>
+      </w:r>
+      <w:r>
+        <w:t xml:space="preserve"> ana aşamada yürütülmüştür. İlk aşamada, mevcut ters makine öğrenmesi modeli kullanıma hazır bir tahmin arayüzüne dönüştürülmüştür. İkinci aşamada, optimizasyon ve MPC hesaplamalarında Cantera simülasyonlarını tekrar tekrar çalıştırmak yerine hızlı sonuç verebilecek ileri bir surrogate model geliştirilmiştir. Son aşamada ise statik optimizasyon ve basit bir MPC senaryosu oluşturularak sistemin farklı biyoyağ kompozisyonları ve bozucu etkiler altında nasıl davrandığı incelenmiştir.</w:t>
       </w:r>
     </w:p>
     <w:p>
@@ -1075,11 +1078,7 @@
         <w:jc w:val="both"/>
       </w:pPr>
       <w:r>
-        <w:t xml:space="preserve">Bu bölümde sırasıyla önceki çalışmanın bu döneme nasıl temel oluşturduğu, geliştirilen soft-sensor yapısı, BiooilID bazlı validasyon, ileri surrogate model, optimizasyon problemi, statik optimizasyon sonuçları ve MPC senaryosu açıklanacaktır. Çalışma sonunda elde edilen tablolar </w:t>
-      </w:r>
-      <w:r>
-        <w:lastRenderedPageBreak/>
-        <w:t>ve figürler, geliştirilen sistemin hem tahmin hem de kontrol/optimizasyon açısından uygulanabilirliğini göstermek amacıyla rapora eklenmiştir.</w:t>
+        <w:t>Bu bölümde sırasıyla önceki çalışmanın bu döneme nasıl temel oluşturduğu, geliştirilen soft-sensor yapısı, ileri surrogate model, optimizasyon problemi, statik optimizasyon sonuçları ve MPC senaryosu açıklanacaktır. Çalışma sonunda elde edilen tablolar ve figürler, geliştirilen sistemin hem tahmin hem de kontrol/optimizasyon açısından uygulanabilirliğini göstermek amacıyla rapora eklenmiştir.</w:t>
       </w:r>
     </w:p>
     <w:p>
@@ -1095,6 +1094,7 @@
           <w:b/>
           <w:bCs/>
         </w:rPr>
+        <w:lastRenderedPageBreak/>
         <w:t xml:space="preserve">B.2.1 </w:t>
       </w:r>
       <w:r>
@@ -1147,11 +1147,11 @@
         <w:jc w:val="both"/>
       </w:pPr>
       <w:r>
-        <w:t xml:space="preserve">Modelin çalışması sırasında öncelikle giriş değişkenleri eğitim aşamasında kullanılan ölçeklendirici ile standartlaştırılmaktadır. Daha sonra standart MLP modeli bu ölçeklendirilmiş girdiler üzerinden altı bileşenli biyoyağ kompozisyonunu tahmin etmektedir. Model çıktıları </w:t>
+        <w:t xml:space="preserve">Modelin çalışması sırasında öncelikle giriş değişkenleri eğitim aşamasında kullanılan ölçeklendirici ile standartlaştırılmaktadır. Daha sonra standart MLP modeli bu ölçeklendirilmiş girdiler üzerinden altı bileşenli biyoyağ kompozisyonunu tahmin etmektedir. Model çıktıları tekrar gerçek yüzde ölçeğine dönüştürülmekte ve negatif tahminler fiziksel anlam taşımadığı için sıfır altına düşmeyecek şekilde sınırlandırılmaktadır. Gerekli durumlarda çıktı bileşenleri toplamı %100 olacak şekilde normalize edilmektedir. Bu işlem, MPC ve optimizasyon </w:t>
       </w:r>
       <w:r>
         <w:lastRenderedPageBreak/>
-        <w:t>tekrar gerçek yüzde ölçeğine dönüştürülmekte ve negatif tahminler fiziksel anlam taşımadığı için sıfır altına düşmeyecek şekilde sınırlandırılmaktadır. Gerekli durumlarda çıktı bileşenleri toplamı %100 olacak şekilde normalize edilmektedir. Bu işlem, MPC ve optimizasyon aşamalarında fiziksel olarak anlamlı bir biyoyağ kompozisyonunun kullanılmasını sağlamaktadır.</w:t>
+        <w:t>aşamalarında fiziksel olarak anlamlı bir biyoyağ kompozisyonunun kullanılmasını sağlamaktadır.</w:t>
       </w:r>
     </w:p>
     <w:p>
@@ -1160,7 +1160,7 @@
         <w:jc w:val="both"/>
       </w:pPr>
       <w:r>
-        <w:t>Soft-sensor yapısının genel çalışma mantığı Şekil B.3'te gösterilecektir. Reformerden elde edilen singaz kompozisyonu ve bilinen proses koşulları ters ML modeline girdi olarak verilmekte, model biyoyağ kompozisyonunu tahmin etmekte ve bu tahmin ileri model ile optimizasyon bloğuna aktarılmaktadır. Böylece proses çıkışından hammadde kompozisyonu kestirilmekte ve bu kestirim kullanılarak bir sonraki kontrol hamlesi hesaplanmaktadır.</w:t>
+        <w:t>Reformerden elde edilen singaz kompozisyonu ve bilinen proses koşulları ters ML modeline girdi olarak verilmekte, model biyoyağ kompozisyonunu tahmin etmekte ve bu tahmin ileri model ile optimizasyon bloğuna aktarılmaktadır. Böylece proses çıkışından hammadde kompozisyonu kestirilmekte ve bu kestirim kullanılarak bir sonraki kontrol hamlesi hesaplanmaktadır.</w:t>
       </w:r>
     </w:p>
     <w:p>
@@ -1194,14 +1194,28 @@
           <w:b/>
           <w:bCs/>
         </w:rPr>
-        <w:t xml:space="preserve">B.2.2 </w:t>
+        <w:t>B.2.</w:t>
       </w:r>
       <w:r>
         <w:rPr>
           <w:b/>
           <w:bCs/>
         </w:rPr>
-        <w:t>BiooilID bazlı model validasyonu</w:t>
+        <w:t>2</w:t>
+      </w:r>
+      <w:r>
+        <w:rPr>
+          <w:b/>
+          <w:bCs/>
+        </w:rPr>
+        <w:t xml:space="preserve"> </w:t>
+      </w:r>
+      <w:r>
+        <w:rPr>
+          <w:b/>
+          <w:bCs/>
+        </w:rPr>
+        <w:t>İleri surrogate modelin geliştirilmesi</w:t>
       </w:r>
     </w:p>
     <w:p>
@@ -1210,7 +1224,7 @@
         <w:jc w:val="both"/>
       </w:pPr>
       <w:r>
-        <w:t>Önceki tez izleme döneminde ters makine öğrenmesi modelinin performansı train, validation ve test kümeleri üzerinden değerlendirilmiş ve standart MLP modeli test setinde ortalama R2=0.863, ortalama MAE=%4.03 başarısına ulaşmıştır. Bu sonuç, modelin genel olarak yüksek doğrulukla çalıştığını göstermektedir. Ancak önceki değerlendirmede veri ayrımı satır bazında yapılmıştır. Veri setinde her bir biyoyağ kompozisyonu farklı sıcaklık, basınç ve buhar/karbon oranı koşulları altında tekrarlandığı için, satır bazlı ayrım yapıldığında aynı BiooilID'ye ait farklı proses koşulları hem eğitim hem de test kümelerinde yer alabilmektedir.</w:t>
+        <w:t>Bu dönemde, ters makine öğrenmesi modelini optimizasyon ve MPC yapısında kullanabilmek için ters tahmin yapısını tamamlayan bir ileri surrogate model geliştirilmiştir. Ters model, reformer çalışma koşulları ve sentez gazı bileşiminden biyoyağ kompozisyonunu tahmin etmektedir. Optimizasyon algoritmasının aday sıcaklık, basınç ve buhar/karbon oranı değerlerini hızlı biçimde değerlendirebilmesi için ise belirli bir biyoyağ kompozisyonu ve proses koşulu altında oluşacak sentez gazı bileşimini öngören ileri modele ihtiyaç duyulmuştur.</w:t>
       </w:r>
     </w:p>
     <w:p>
@@ -1223,241 +1237,6 @@
           <w:noProof/>
         </w:rPr>
         <w:lastRenderedPageBreak/>
-        <w:drawing>
-          <wp:inline distT="0" distB="0" distL="0" distR="0" wp14:anchorId="5A557DDD" wp14:editId="397DC45A">
-            <wp:extent cx="5756910" cy="3134233"/>
-            <wp:effectExtent l="19050" t="19050" r="15240" b="28575"/>
-            <wp:docPr id="366889183" name="Resim 6"/>
-            <wp:cNvGraphicFramePr>
-              <a:graphicFrameLocks xmlns:a="http://schemas.openxmlformats.org/drawingml/2006/main" noChangeAspect="1"/>
-            </wp:cNvGraphicFramePr>
-            <a:graphic xmlns:a="http://schemas.openxmlformats.org/drawingml/2006/main">
-              <a:graphicData uri="http://schemas.openxmlformats.org/drawingml/2006/picture">
-                <pic:pic xmlns:pic="http://schemas.openxmlformats.org/drawingml/2006/picture">
-                  <pic:nvPicPr>
-                    <pic:cNvPr id="0" name="Picture 6"/>
-                    <pic:cNvPicPr>
-                      <a:picLocks noChangeAspect="1" noChangeArrowheads="1"/>
-                    </pic:cNvPicPr>
-                  </pic:nvPicPr>
-                  <pic:blipFill rotWithShape="1">
-                    <a:blip r:embed="rId11" cstate="print">
-                      <a:extLst>
-                        <a:ext uri="{28A0092B-C50C-407E-A947-70E740481C1C}">
-                          <a14:useLocalDpi xmlns:a14="http://schemas.microsoft.com/office/drawing/2010/main" val="0"/>
-                        </a:ext>
-                      </a:extLst>
-                    </a:blip>
-                    <a:srcRect t="7030"/>
-                    <a:stretch>
-                      <a:fillRect/>
-                    </a:stretch>
-                  </pic:blipFill>
-                  <pic:spPr bwMode="auto">
-                    <a:xfrm>
-                      <a:off x="0" y="0"/>
-                      <a:ext cx="5756910" cy="3134233"/>
-                    </a:xfrm>
-                    <a:prstGeom prst="rect">
-                      <a:avLst/>
-                    </a:prstGeom>
-                    <a:noFill/>
-                    <a:ln w="9525" cap="flat" cmpd="sng" algn="ctr">
-                      <a:solidFill>
-                        <a:sysClr val="windowText" lastClr="000000"/>
-                      </a:solidFill>
-                      <a:prstDash val="solid"/>
-                      <a:round/>
-                      <a:headEnd type="none" w="med" len="med"/>
-                      <a:tailEnd type="none" w="med" len="med"/>
-                      <a:extLst>
-                        <a:ext uri="{C807C97D-BFC1-408E-A445-0C87EB9F89A2}">
-                          <ask:lineSketchStyleProps xmlns:ask="http://schemas.microsoft.com/office/drawing/2018/sketchyshapes" sd="0">
-                            <a:custGeom>
-                              <a:avLst/>
-                              <a:gdLst/>
-                              <a:ahLst/>
-                              <a:cxnLst/>
-                              <a:rect l="0" t="0" r="0" b="0"/>
-                              <a:pathLst/>
-                            </a:custGeom>
-                            <ask:type/>
-                          </ask:lineSketchStyleProps>
-                        </a:ext>
-                      </a:extLst>
-                    </a:ln>
-                    <a:extLst>
-                      <a:ext uri="{53640926-AAD7-44D8-BBD7-CCE9431645EC}">
-                        <a14:shadowObscured xmlns:a14="http://schemas.microsoft.com/office/drawing/2010/main"/>
-                      </a:ext>
-                    </a:extLst>
-                  </pic:spPr>
-                </pic:pic>
-              </a:graphicData>
-            </a:graphic>
-          </wp:inline>
-        </w:drawing>
-      </w:r>
-    </w:p>
-    <w:p>
-      <w:pPr>
-        <w:spacing w:after="240" w:line="360" w:lineRule="auto"/>
-        <w:jc w:val="center"/>
-      </w:pPr>
-      <w:r>
-        <w:rPr>
-          <w:b/>
-          <w:bCs/>
-        </w:rPr>
-        <w:t xml:space="preserve">Figür </w:t>
-      </w:r>
-      <w:r>
-        <w:rPr>
-          <w:b/>
-          <w:bCs/>
-        </w:rPr>
-        <w:t>2</w:t>
-      </w:r>
-      <w:r>
-        <w:rPr>
-          <w:b/>
-          <w:bCs/>
-        </w:rPr>
-        <w:t>.</w:t>
-      </w:r>
-      <w:r>
-        <w:t xml:space="preserve"> </w:t>
-      </w:r>
-      <w:r>
-        <w:t>Satır bazlı test ile BiooilID bazlı test yaklaşımının karşılaştırılması</w:t>
-      </w:r>
-    </w:p>
-    <w:p>
-      <w:pPr>
-        <w:spacing w:before="240" w:after="240" w:line="360" w:lineRule="auto"/>
-        <w:jc w:val="both"/>
-      </w:pPr>
-      <w:r>
-        <w:t>Bu durum model başarısının yorumlanması açısından önemlidir. Satır bazlı test, modelin daha önce gördüğü biyoyağ kompozisyonlarının farklı proses koşullarındaki davranışını ne kadar iyi öğrendiğini göstermektedir. Başka bir ifadeyle, bu test modelin proses koşullarına bağlı interpolasyon kabiliyetini değerlendirmektedir. Buna karşılık, modelin hiç görmediği yeni bir biyoyağ kompozisyonuna genelleme yapıp yapamadığını anlamak için biyoyağ kimliği bazında ayrım yapılması gerekmektedir. Bu nedenle bu dönemde ek bir BiooilID bazlı validasyon çalışması yapılmıştır.</w:t>
-      </w:r>
-    </w:p>
-    <w:p>
-      <w:pPr>
-        <w:spacing w:before="240" w:after="240" w:line="360" w:lineRule="auto"/>
-        <w:jc w:val="both"/>
-      </w:pPr>
-      <w:r>
-        <w:t>BiooilID bazlı validasyonda veri seti, biyoyağ kimlikleri birbirinden tamamen ayrılacak şekilde eğitim ve test kümelerine bölünmüştür. Toplam 30 farklı biyoyağ kompozisyonundan 24 tanesi eğitim kümesinde, 6 tanesi ise test kümesinde bırakılmıştır. Böylece test kümesindeki biyoyağlar model eğitimi sırasında hiç görülmemiştir. Eğitim kümesinde 1080 örnek, test kümesinde ise 270 örnek yer almıştır. Bu kurgu, önceki satır bazlı ayrımdan daha zor ve daha gerçekçi bir genelleme testi olarak değerlendirilmiştir.</w:t>
-      </w:r>
-    </w:p>
-    <w:p>
-      <w:pPr>
-        <w:spacing w:before="240" w:after="240" w:line="360" w:lineRule="auto"/>
-        <w:jc w:val="both"/>
-      </w:pPr>
-      <w:r>
-        <w:t>Bu validasyon çalışmasında hızlı bir genelleme denetimi yapmak amacıyla ExtraTrees tabanlı çok çıktılı regresyon modeli kullanılmıştır. Model girdileri önceki ters tahmin yaklaşımıyla aynı tutulmuştur: reformer sıcaklığı, basınç, buhar/karbon oranı ve H2, CO, CO2, CH4, H2O mol yüzdeleri. Çıkış değişkenleri yine aromatikler, asitler, alkoller, furanlar, fenoller ve aldehit-</w:t>
-      </w:r>
-      <w:r>
-        <w:lastRenderedPageBreak/>
-        <w:t>ketonlar olarak seçilmiştir. Böylece BiooilID bazlı ayrımın, ters tahmin probleminin bileşen bazındaki genelleme başarısı üzerindeki etkisi incelenmiştir.</w:t>
-      </w:r>
-    </w:p>
-    <w:p>
-      <w:pPr>
-        <w:spacing w:before="240" w:after="240" w:line="360" w:lineRule="auto"/>
-        <w:jc w:val="both"/>
-      </w:pPr>
-      <w:r>
-        <w:t>Elde edilen sonuçlara göre aromatikler ve asitler için model yeni biyoyağlara karşı yüksek doğruluk göstermiştir. Aromatikler için R2=0.951 ve MAE=%5.84, asitler için R2=0.803 ve MAE=%5.23 olarak hesaplanmıştır. Fenoller için R2=0.698, aldehit-ketonlar için R2=0.624 ve furanlar için R2=0.464 değerleri elde edilmiştir. Bu sonuçlar, bazı bileşenlerin singaz kompozisyonu üzerinden yeni biyoyağlarda da tahmin edilebilir olduğunu göstermektedir.</w:t>
-      </w:r>
-    </w:p>
-    <w:p>
-      <w:pPr>
-        <w:spacing w:before="240" w:after="240" w:line="360" w:lineRule="auto"/>
-        <w:jc w:val="both"/>
-      </w:pPr>
-      <w:r>
-        <w:t>Buna karşılık alkoller için R2 değeri negatif çıkmıştır. Bu durum, alkol bileşeninin test kümesinde düşük varyansa sahip olması, singaz çıktıları üzerinde daha zayıf veya diğer bileşenlerle karışan bir etki bırakması ve modelin bu bileşen için yeni biyoyağlara genelleme yapmakta zorlanmasıyla açıklanabilir. Ortalama R2 değeri bu negatif sonuç nedeniyle düşük görünmektedir; ancak ortalama MAE değeri %4.62 seviyesinde kalmıştır. Bu nedenle BiooilID bazlı validasyon sonucu, modelin bazı bileşenlerde güçlü, bazı bileşenlerde ise daha sınırlı genelleme kabiliyetine sahip olduğunu göstermektedir.</w:t>
-      </w:r>
-    </w:p>
-    <w:p>
-      <w:pPr>
-        <w:spacing w:before="240" w:after="240" w:line="360" w:lineRule="auto"/>
-        <w:jc w:val="both"/>
-      </w:pPr>
-      <w:r>
-        <w:t>Bu bulgu tez çalışması açısından önemlidir. Önceki dönemde elde edilen yüksek MLP performansı, modelin mevcut veri seti içinde proses koşullarına bağlı ters tahmin görevini başarılı biçimde öğrendiğini göstermektedir. Bu dönemde yapılan BiooilID bazlı validasyon ise daha zor bir senaryoyu temsil etmekte ve modelin tamamen yeni biyoyağ kompozisyonlarında daha dikkatli değerlendirilmesi gerektiğini ortaya koymaktadır. Bu nedenle bu sonuçlar bir başarısızlık olarak değil, modelin uygulama sınırlarını belirleyen ek bir validasyon aşaması olarak değerlendirilmiştir.</w:t>
-      </w:r>
-    </w:p>
-    <w:p>
-      <w:pPr>
-        <w:spacing w:before="240" w:after="240" w:line="360" w:lineRule="auto"/>
-        <w:jc w:val="both"/>
-      </w:pPr>
-      <w:r>
-        <w:t>MPC ve optimizasyon çalışmasında bu sonuç şu şekilde dikkate alınmıştır: Ters ML modeli, mevcut veri tabanındaki biyoyağ kompozisyon aralığına benzer örneklerde soft-sensor olarak kullanılabilir. Ancak veri tabanında temsil edilmeyen çok farklı biyoyağ kompozisyonları için model tahminlerinin belirsizliği artabilir. Bu nedenle sonraki çalışmalarda BiooilID bazlı MLP yeniden eğitimi, belirsizlik tahmini ve yeni deneysel/simülasyon verileriyle veri setinin genişletilmesi önerilmektedir.</w:t>
-      </w:r>
-    </w:p>
-    <w:p>
-      <w:pPr>
-        <w:spacing w:before="240" w:after="240" w:line="360" w:lineRule="auto"/>
-        <w:rPr>
-          <w:b/>
-          <w:bCs/>
-        </w:rPr>
-      </w:pPr>
-      <w:r>
-        <w:rPr>
-          <w:b/>
-          <w:bCs/>
-        </w:rPr>
-        <w:t>B.2.</w:t>
-      </w:r>
-      <w:r>
-        <w:rPr>
-          <w:b/>
-          <w:bCs/>
-        </w:rPr>
-        <w:t>3</w:t>
-      </w:r>
-      <w:r>
-        <w:rPr>
-          <w:b/>
-          <w:bCs/>
-        </w:rPr>
-        <w:t xml:space="preserve"> </w:t>
-      </w:r>
-      <w:r>
-        <w:rPr>
-          <w:b/>
-          <w:bCs/>
-        </w:rPr>
-        <w:t>İleri surrogate modelin geliştirilmesi</w:t>
-      </w:r>
-    </w:p>
-    <w:p>
-      <w:pPr>
-        <w:spacing w:before="240" w:after="240" w:line="360" w:lineRule="auto"/>
-        <w:jc w:val="both"/>
-      </w:pPr>
-      <w:r>
-        <w:t xml:space="preserve">Bu dönemde, ters makine öğrenmesi modelini optimizasyon ve MPC yapısında kullanabilmek için ters tahmin yapısını tamamlayan bir ileri surrogate model geliştirilmiştir. Ters model, </w:t>
-      </w:r>
-      <w:r>
-        <w:lastRenderedPageBreak/>
-        <w:t>reformer çalışma koşulları ve sentez gazı bileşiminden biyoyağ kompozisyonunu tahmin etmektedir. Optimizasyon algoritmasının aday sıcaklık, basınç ve buhar/karbon oranı değerlerini hızlı biçimde değerlendirebilmesi için ise belirli bir biyoyağ kompozisyonu ve proses koşulu altında oluşacak sentez gazı bileşimini öngören ileri modele ihtiyaç duyulmuştur.</w:t>
-      </w:r>
-    </w:p>
-    <w:p>
-      <w:pPr>
-        <w:spacing w:before="240" w:line="360" w:lineRule="auto"/>
-        <w:jc w:val="both"/>
-      </w:pPr>
-      <w:r>
-        <w:rPr>
-          <w:noProof/>
-        </w:rPr>
         <w:drawing>
           <wp:inline distT="0" distB="0" distL="0" distR="0" wp14:anchorId="31B918B3" wp14:editId="74703D47">
             <wp:extent cx="5756910" cy="2975788"/>
@@ -1476,7 +1255,7 @@
                     </pic:cNvPicPr>
                   </pic:nvPicPr>
                   <pic:blipFill rotWithShape="1">
-                    <a:blip r:embed="rId12" cstate="print">
+                    <a:blip r:embed="rId11" cstate="print">
                       <a:extLst>
                         <a:ext uri="{28A0092B-C50C-407E-A947-70E740481C1C}">
                           <a14:useLocalDpi xmlns:a14="http://schemas.microsoft.com/office/drawing/2010/main" val="0"/>
@@ -1551,7 +1330,7 @@
           <w:b/>
           <w:bCs/>
         </w:rPr>
-        <w:t>3</w:t>
+        <w:t>2</w:t>
       </w:r>
       <w:r>
         <w:rPr>
@@ -1575,34 +1354,18 @@
     </w:p>
     <w:p>
       <w:pPr>
-        <w:spacing w:before="240" w:after="240" w:line="360" w:lineRule="auto"/>
+        <w:spacing w:before="240" w:line="360" w:lineRule="auto"/>
         <w:jc w:val="both"/>
       </w:pPr>
       <w:r>
-        <w:t>Model, temizlenmiş Cantera veri seti üzerinde çok çıkışlı regresyon problemi olarak eğitilmiştir. Geliştirilen yazılım yapısında model eğitimi ve değerlendirme işlemleri `surrogate_model.py` modülü altında toplanmıştır. Bu yapı veri setinin okunması, giriş-çıkış kolonlarının ayrılması, model eğitimi, test performansının hesaplanması ve eğitilmiş modelin optimizasyon modülüne aktarılması adımlarını içermektedir.</w:t>
-      </w:r>
-    </w:p>
-    <w:p>
-      <w:pPr>
-        <w:spacing w:before="240" w:after="240" w:line="360" w:lineRule="auto"/>
-        <w:jc w:val="both"/>
-      </w:pPr>
-    </w:p>
-    <w:p>
-      <w:pPr>
-        <w:spacing w:before="240" w:after="240" w:line="360" w:lineRule="auto"/>
-        <w:jc w:val="both"/>
-      </w:pPr>
-      <w:r>
         <w:rPr>
           <w:noProof/>
         </w:rPr>
-        <w:lastRenderedPageBreak/>
         <w:drawing>
-          <wp:inline distT="0" distB="0" distL="0" distR="0" wp14:anchorId="409872E6" wp14:editId="1A24C6EC">
+          <wp:inline distT="0" distB="0" distL="0" distR="0" wp14:anchorId="40B4ED74" wp14:editId="5852FEE1">
             <wp:extent cx="5756910" cy="3100705"/>
             <wp:effectExtent l="19050" t="19050" r="15240" b="23495"/>
-            <wp:docPr id="1246403151" name="Resim 8"/>
+            <wp:docPr id="1805753103" name="Resim 8"/>
             <wp:cNvGraphicFramePr>
               <a:graphicFrameLocks xmlns:a="http://schemas.openxmlformats.org/drawingml/2006/main" noChangeAspect="1"/>
             </wp:cNvGraphicFramePr>
@@ -1616,7 +1379,7 @@
                     </pic:cNvPicPr>
                   </pic:nvPicPr>
                   <pic:blipFill>
-                    <a:blip r:embed="rId13" cstate="print">
+                    <a:blip r:embed="rId12" cstate="print">
                       <a:extLst>
                         <a:ext uri="{28A0092B-C50C-407E-A947-70E740481C1C}">
                           <a14:useLocalDpi xmlns:a14="http://schemas.microsoft.com/office/drawing/2010/main" val="0"/>
@@ -1652,7 +1415,7 @@
     </w:p>
     <w:p>
       <w:pPr>
-        <w:spacing w:before="240" w:after="240" w:line="360" w:lineRule="auto"/>
+        <w:spacing w:after="240" w:line="360" w:lineRule="auto"/>
         <w:jc w:val="center"/>
       </w:pPr>
       <w:r>
@@ -1667,7 +1430,7 @@
           <w:b/>
           <w:bCs/>
         </w:rPr>
-        <w:t>4</w:t>
+        <w:t>3</w:t>
       </w:r>
       <w:r>
         <w:rPr>
@@ -1685,6 +1448,21 @@
         <w:spacing w:before="240" w:after="240" w:line="360" w:lineRule="auto"/>
         <w:jc w:val="both"/>
       </w:pPr>
+    </w:p>
+    <w:p>
+      <w:pPr>
+        <w:spacing w:before="240" w:after="240" w:line="360" w:lineRule="auto"/>
+        <w:jc w:val="both"/>
+      </w:pPr>
+      <w:r>
+        <w:t>Model, temizlenmiş Cantera veri seti üzerinde çok çıkışlı regresyon problemi olarak eğitilmiştir. Geliştirilen yazılım yapısında model eğitimi ve değerlendirme işlemleri `surrogate_model.py` modülü altında toplanmıştır. Bu yapı veri setinin okunması, giriş-çıkış kolonlarının ayrılması, model eğitimi, test performansının hesaplanması ve eğitilmiş modelin optimizasyon modülüne aktarılması adımlarını içermektedir.</w:t>
+      </w:r>
+    </w:p>
+    <w:p>
+      <w:pPr>
+        <w:spacing w:before="240" w:after="240" w:line="360" w:lineRule="auto"/>
+        <w:jc w:val="both"/>
+      </w:pPr>
       <w:r>
         <w:t>Model performansı sentez gazı bileşenleri ve H2/CO oranı için ayrı ayrı değerlendirilmiştir. Ortalama R2 değerinin 0.996, ortalama RMSE değerinin 0.268 ve ortalama MAE değerinin 0.125 seviyesinde bulunması, ileri surrogate modelin Cantera tabanlı veri uzayını yüksek doğrulukla temsil edebildiğini göstermektedir. Bu nedenle bu model, bu dönem geliştirilen statik optimizasyon ve MPC senaryolarında hızlı proses tahmincisi olarak kullanılmıştır.</w:t>
       </w:r>
@@ -1709,7 +1487,7 @@
           <w:b/>
           <w:bCs/>
         </w:rPr>
-        <w:t>4</w:t>
+        <w:t>3</w:t>
       </w:r>
       <w:r>
         <w:rPr>
@@ -1751,10 +1529,7 @@
         <w:t>Tablo 2.</w:t>
       </w:r>
       <w:r>
-        <w:t xml:space="preserve"> </w:t>
-      </w:r>
-      <w:r>
-        <w:t>Optimizasyon karar değişkenleri ve sınırları</w:t>
+        <w:t xml:space="preserve"> Optimizasyon karar değişkenleri ve sınırları</w:t>
       </w:r>
     </w:p>
     <w:tbl>
@@ -2120,7 +1895,6 @@
         <w:jc w:val="both"/>
       </w:pPr>
       <w:r>
-        <w:lastRenderedPageBreak/>
         <w:t>Amaç fonksiyonu iki ana</w:t>
       </w:r>
       <w:r>
@@ -2129,6 +1903,12 @@
       <w:r>
         <w:t>önlemek için ceza terimleri kullanılmıştır.</w:t>
       </w:r>
+    </w:p>
+    <w:p>
+      <w:pPr>
+        <w:spacing w:before="240" w:after="240" w:line="360" w:lineRule="auto"/>
+        <w:jc w:val="both"/>
+      </w:pPr>
     </w:p>
     <w:p>
       <w:pPr>
@@ -2140,13 +1920,11 @@
           <w:b/>
           <w:bCs/>
         </w:rPr>
+        <w:lastRenderedPageBreak/>
         <w:t>Tablo 3</w:t>
       </w:r>
       <w:r>
-        <w:t xml:space="preserve">. </w:t>
-      </w:r>
-      <w:r>
-        <w:t>Amaç fonksiyonu bileşenleri</w:t>
+        <w:t>. Amaç fonksiyonu bileşenleri</w:t>
       </w:r>
     </w:p>
     <w:tbl>
@@ -2452,21 +2230,14 @@
           <w:b/>
           <w:bCs/>
         </w:rPr>
-        <w:t>5</w:t>
+        <w:t>4</w:t>
       </w:r>
       <w:r>
         <w:rPr>
           <w:b/>
           <w:bCs/>
         </w:rPr>
-        <w:t xml:space="preserve"> </w:t>
-      </w:r>
-      <w:r>
-        <w:rPr>
-          <w:b/>
-          <w:bCs/>
-        </w:rPr>
-        <w:t>Statik optimizasyon çalışmaları</w:t>
+        <w:t xml:space="preserve"> Statik optimizasyon çalışmaları</w:t>
       </w:r>
     </w:p>
     <w:p>
@@ -2480,7 +2251,22 @@
     </w:p>
     <w:p>
       <w:pPr>
-        <w:spacing w:before="240" w:line="360" w:lineRule="auto"/>
+        <w:spacing w:before="240" w:after="240" w:line="360" w:lineRule="auto"/>
+        <w:jc w:val="both"/>
+      </w:pPr>
+      <w:r>
+        <w:t>Başlangıç koşullarında H2/CO oranları yaklaşık 5.78-6.07 aralığında bulunmuştur. Optimizasyon sonrasında bu oranlar seçilen biyoyağ kompozisyonuna ve hedef değere bağlı olarak yaklaşık 2.52-2.82 aralığına düşürülmüştür. Bu sonuç, geliştirilen optimizasyon yapısının sentez gazı kompozisyonunu hedeflenen kimyasal kullanım aralığına yaklaştırabildiğini göstermektedir. Bununla birlikte H2/CO = 2.0 hedefi, tanımlanan kontrol değişkeni sınırları ve mevcut veri uzayı içinde tam olarak yakalanamamıştır. Bu durum, hedef değerin bazı biyoyağ kompozisyonları için mevcut çalışma aralığında erişilebilir olmadığını göstermektedir.</w:t>
+      </w:r>
+    </w:p>
+    <w:p>
+      <w:pPr>
+        <w:spacing w:before="240" w:after="240" w:line="360" w:lineRule="auto"/>
+        <w:jc w:val="both"/>
+      </w:pPr>
+    </w:p>
+    <w:p>
+      <w:pPr>
+        <w:spacing w:before="240"/>
         <w:jc w:val="both"/>
       </w:pPr>
       <w:r>
@@ -2489,7 +2275,7 @@
         </w:rPr>
         <w:lastRenderedPageBreak/>
         <w:drawing>
-          <wp:inline distT="0" distB="0" distL="0" distR="0" wp14:anchorId="78246176" wp14:editId="3CDD46B5">
+          <wp:inline distT="0" distB="0" distL="0" distR="0" wp14:anchorId="78246176" wp14:editId="5A75127C">
             <wp:extent cx="5756910" cy="3335655"/>
             <wp:effectExtent l="19050" t="19050" r="15240" b="17145"/>
             <wp:docPr id="774023649" name="Resim 9"/>
@@ -2506,7 +2292,7 @@
                     </pic:cNvPicPr>
                   </pic:nvPicPr>
                   <pic:blipFill>
-                    <a:blip r:embed="rId14" cstate="print">
+                    <a:blip r:embed="rId13" cstate="print">
                       <a:extLst>
                         <a:ext uri="{28A0092B-C50C-407E-A947-70E740481C1C}">
                           <a14:useLocalDpi xmlns:a14="http://schemas.microsoft.com/office/drawing/2010/main" val="0"/>
@@ -2542,7 +2328,7 @@
     </w:p>
     <w:p>
       <w:pPr>
-        <w:spacing w:after="240" w:line="276" w:lineRule="auto"/>
+        <w:spacing w:after="240"/>
         <w:jc w:val="center"/>
       </w:pPr>
       <w:r>
@@ -2557,7 +2343,7 @@
           <w:b/>
           <w:bCs/>
         </w:rPr>
-        <w:t>5</w:t>
+        <w:t>4</w:t>
       </w:r>
       <w:r>
         <w:rPr>
@@ -2567,10 +2353,7 @@
         <w:t>.</w:t>
       </w:r>
       <w:r>
-        <w:t xml:space="preserve"> </w:t>
-      </w:r>
-      <w:r>
-        <w:t>Statik optimizasyon senaryolarında başlangıç ve optimize edilmiş H2/CO oranlarının karşılaştırılması.</w:t>
+        <w:t xml:space="preserve"> Statik optimizasyon senaryolarında başlangıç ve optimize edilmiş H2/CO oranlarının karşılaştırılması.</w:t>
       </w:r>
     </w:p>
     <w:p>
@@ -2579,7 +2362,37 @@
         <w:jc w:val="both"/>
       </w:pPr>
       <w:r>
-        <w:t>Başlangıç koşullarında H2/CO oranları yaklaşık 5.78-6.07 aralığında bulunmuştur. Optimizasyon sonrasında bu oranlar seçilen biyoyağ kompozisyonuna ve hedef değere bağlı olarak yaklaşık 2.52-2.82 aralığına düşürülmüştür. Bu sonuç, geliştirilen optimizasyon yapısının sentez gazı kompozisyonunu hedeflenen kimyasal kullanım aralığına yaklaştırabildiğini göstermektedir. Bununla birlikte H2/CO = 2.0 hedefi, tanımlanan kontrol değişkeni sınırları ve mevcut veri uzayı içinde tam olarak yakalanamamıştır. Bu durum, hedef değerin bazı biyoyağ kompozisyonları için mevcut çalışma aralığında erişilebilir olmadığını göstermektedir.</w:t>
+        <w:t>H2/CO = 2.5 hedefinde, özellikle aromatik bakımından zengin ve dengeli biyoyağ örneklerinde hedefe daha yakın sonuçlar daha düşük enerji maliyetiyle elde edilmiştir. Asit bakımından zengin biyoyağ örneğinde ise model, hedefe yaklaşmak için yine yüksek sıcaklık ve düşük basınç koşulunu seçmiştir. Bu bulgu, biyoyağ kompozisyonunun optimum proses koşulları üzerinde doğrudan etkili olduğunu ve kompozisyon bilgisinin optimizasyon yapısına dahil edilmesinin gerekli olduğunu göstermektedir.</w:t>
+      </w:r>
+    </w:p>
+    <w:p>
+      <w:pPr>
+        <w:spacing w:before="240" w:after="240" w:line="360" w:lineRule="auto"/>
+        <w:rPr>
+          <w:b/>
+          <w:bCs/>
+        </w:rPr>
+      </w:pPr>
+      <w:r>
+        <w:rPr>
+          <w:b/>
+          <w:bCs/>
+        </w:rPr>
+        <w:t>B.2.</w:t>
+      </w:r>
+      <w:r>
+        <w:rPr>
+          <w:b/>
+          <w:bCs/>
+        </w:rPr>
+        <w:t>5</w:t>
+      </w:r>
+      <w:r>
+        <w:rPr>
+          <w:b/>
+          <w:bCs/>
+        </w:rPr>
+        <w:t xml:space="preserve"> Model öngörülü kontrol senaryosunun geliştirilmesi</w:t>
       </w:r>
     </w:p>
     <w:p>
@@ -2588,72 +2401,41 @@
         <w:jc w:val="both"/>
       </w:pPr>
       <w:r>
-        <w:t>H2/CO = 2.5 hedefinde, özellikle aromatik bakımından zengin ve dengeli biyoyağ örneklerinde hedefe daha yakın sonuçlar daha düşük enerji maliyetiyle elde edilmiştir. Asit bakımından zengin biyoyağ örneğinde ise model, hedefe yaklaşmak için yine yüksek sıcaklık ve düşük basınç koşulunu seçmiştir. Bu bulgu, biyoyağ kompozisyonunun optimum proses koşulları üzerinde doğrudan etkili olduğunu ve kompozisyon bilgisinin optimizasyon yapısına dahil edilmesinin gerekli olduğunu göstermektedir.</w:t>
+        <w:t xml:space="preserve">Statik optimizasyon çalışmasının ardından, geliştirilen soft-sensor ve ileri surrogate model kullanılarak basit bir model öngörülü kontrol senaryosu oluşturulmuştur. Bu senaryoda amaç, biyoyağ kompozisyonu zamanla değiştiğinde sentez gazı H2/CO oranını hedef değere yakın tutacak </w:t>
+      </w:r>
+      <w:r>
+        <w:t>kontrol hareketlerini hesaplamaktır. MPC yapısı, her zaman adımında mevcut ölçüm bilgisini kullanarak biyoyağ kompozisyonunu tahmin etmekte, ardından ileri surrogate model yardımıyla yeni kontrol değişkenlerini belirlemektedir.</w:t>
       </w:r>
     </w:p>
     <w:p>
       <w:pPr>
         <w:spacing w:before="240" w:after="240" w:line="360" w:lineRule="auto"/>
+        <w:jc w:val="both"/>
+      </w:pPr>
+    </w:p>
+    <w:p>
+      <w:pPr>
+        <w:spacing w:before="240" w:after="240" w:line="360" w:lineRule="auto"/>
+        <w:jc w:val="both"/>
+      </w:pPr>
+    </w:p>
+    <w:p>
+      <w:pPr>
+        <w:spacing w:before="240" w:after="240" w:line="360" w:lineRule="auto"/>
+        <w:jc w:val="both"/>
+      </w:pPr>
+    </w:p>
+    <w:p>
+      <w:pPr>
+        <w:spacing w:line="276" w:lineRule="auto"/>
+        <w:jc w:val="both"/>
+      </w:pPr>
+      <w:r>
         <w:rPr>
           <w:b/>
           <w:bCs/>
         </w:rPr>
-      </w:pPr>
-      <w:r>
-        <w:rPr>
-          <w:b/>
-          <w:bCs/>
-        </w:rPr>
-        <w:t>B.2.</w:t>
-      </w:r>
-      <w:r>
-        <w:rPr>
-          <w:b/>
-          <w:bCs/>
-        </w:rPr>
-        <w:t>6</w:t>
-      </w:r>
-      <w:r>
-        <w:rPr>
-          <w:b/>
-          <w:bCs/>
-        </w:rPr>
-        <w:t xml:space="preserve"> </w:t>
-      </w:r>
-      <w:r>
-        <w:rPr>
-          <w:b/>
-          <w:bCs/>
-        </w:rPr>
-        <w:t>Model öngörülü kontrol senaryosunun geliştirilmesi</w:t>
-      </w:r>
-    </w:p>
-    <w:p>
-      <w:pPr>
-        <w:spacing w:before="240" w:after="240" w:line="360" w:lineRule="auto"/>
-        <w:jc w:val="both"/>
-      </w:pPr>
-      <w:r>
-        <w:t xml:space="preserve">Statik optimizasyon çalışmasının ardından, geliştirilen soft-sensor ve ileri surrogate model kullanılarak basit bir model öngörülü kontrol senaryosu oluşturulmuştur. Bu senaryoda amaç, </w:t>
-      </w:r>
-      <w:r>
         <w:lastRenderedPageBreak/>
-        <w:t xml:space="preserve">biyoyağ kompozisyonu zamanla değiştiğinde sentez gazı H2/CO oranını hedef değere yakın tutacak </w:t>
-      </w:r>
-      <w:r>
-        <w:t>kontrol hareketlerini hesaplamaktır. MPC yapısı, her zaman adımında mevcut ölçüm bilgisini kullanarak biyoyağ kompozisyonunu tahmin etmekte, ardından ileri surrogate model yardımıyla yeni kontrol değişkenlerini belirlemektedir.</w:t>
-      </w:r>
-    </w:p>
-    <w:p>
-      <w:pPr>
-        <w:spacing w:line="276" w:lineRule="auto"/>
-        <w:jc w:val="both"/>
-      </w:pPr>
-      <w:r>
-        <w:rPr>
-          <w:b/>
-          <w:bCs/>
-        </w:rPr>
         <w:t xml:space="preserve">Tablo </w:t>
       </w:r>
       <w:r>
@@ -2919,7 +2701,7 @@
               <w:rPr>
                 <w:rFonts w:ascii="Times New Roman" w:hAnsi="Times New Roman" w:cs="Times New Roman"/>
               </w:rPr>
-              <w:t>| Başlangıç S/C oranı</w:t>
+              <w:t>Başlangıç S/C oranı</w:t>
             </w:r>
           </w:p>
         </w:tc>
@@ -3068,7 +2850,7 @@
                     </pic:cNvPicPr>
                   </pic:nvPicPr>
                   <pic:blipFill rotWithShape="1">
-                    <a:blip r:embed="rId15" cstate="print">
+                    <a:blip r:embed="rId14" cstate="print">
                       <a:extLst>
                         <a:ext uri="{28A0092B-C50C-407E-A947-70E740481C1C}">
                           <a14:useLocalDpi xmlns:a14="http://schemas.microsoft.com/office/drawing/2010/main" val="0"/>
@@ -3143,7 +2925,7 @@
           <w:b/>
           <w:bCs/>
         </w:rPr>
-        <w:t>6</w:t>
+        <w:t>5</w:t>
       </w:r>
       <w:r>
         <w:rPr>
@@ -3153,10 +2935,7 @@
         <w:t>.</w:t>
       </w:r>
       <w:r>
-        <w:t xml:space="preserve"> </w:t>
-      </w:r>
-      <w:r>
-        <w:t>Soft-sensor, ileri surrogate model ve optimizasyon bloğundan oluşan MPC kapalı çevrim yapısı</w:t>
+        <w:t xml:space="preserve"> Soft-sensor, ileri surrogate model ve optimizasyon bloğundan oluşan MPC kapalı çevrim yapısı</w:t>
       </w:r>
     </w:p>
     <w:p>
@@ -3165,8 +2944,11 @@
         <w:jc w:val="both"/>
       </w:pPr>
       <w:r>
+        <w:t xml:space="preserve">MPC senaryosunda karar değişkenleri statik optimizasyonla aynı tutulmuştur. Ek olarak, kontrol hareketlerinin çok sert değişmesini önlemek için amaç fonksiyonuna hareket cezası eklenmiştir. Böylece algoritma yalnızca hedef H2/CO oranına yaklaşmayı değil, aynı zamanda daha düzenli kontrol hareketleri üretmeyi de dikkate almıştır. Bu yapı, gerçek zamanlı uygulama için henüz deneysel bir kontrol sistemi değildir; ancak geliştirilen ML modellerinin </w:t>
+      </w:r>
+      <w:r>
         <w:lastRenderedPageBreak/>
-        <w:t>MPC senaryosunda karar değişkenleri statik optimizasyonla aynı tutulmuştur. Ek olarak, kontrol hareketlerinin çok sert değişmesini önlemek için amaç fonksiyonuna hareket cezası eklenmiştir. Böylece algoritma yalnızca hedef H2/CO oranına yaklaşmayı değil, aynı zamanda daha düzenli kontrol hareketleri üretmeyi de dikkate almıştır. Bu yapı, gerçek zamanlı uygulama için henüz deneysel bir kontrol sistemi değildir; ancak geliştirilen ML modellerinin kapalı çevrim karar verme yapısında nasıl kullanılabileceğini gösteren bir hesaplamalı senaryodur.</w:t>
+        <w:t>kapalı çevrim karar verme yapısında nasıl kullanılabileceğini gösteren bir hesaplamalı senaryodur.</w:t>
       </w:r>
     </w:p>
     <w:p>
@@ -3189,21 +2971,14 @@
           <w:b/>
           <w:bCs/>
         </w:rPr>
-        <w:t>7</w:t>
+        <w:t>6</w:t>
       </w:r>
       <w:r>
         <w:rPr>
           <w:b/>
           <w:bCs/>
         </w:rPr>
-        <w:t xml:space="preserve"> </w:t>
-      </w:r>
-      <w:r>
-        <w:rPr>
-          <w:b/>
-          <w:bCs/>
-        </w:rPr>
-        <w:t>MPC senaryo bozucu etki analizi</w:t>
+        <w:t xml:space="preserve"> MPC senaryo bozucu etki analizi</w:t>
       </w:r>
     </w:p>
     <w:p>
@@ -4044,7 +3819,7 @@
                     </pic:cNvPicPr>
                   </pic:nvPicPr>
                   <pic:blipFill rotWithShape="1">
-                    <a:blip r:embed="rId16" cstate="print">
+                    <a:blip r:embed="rId15" cstate="print">
                       <a:extLst>
                         <a:ext uri="{28A0092B-C50C-407E-A947-70E740481C1C}">
                           <a14:useLocalDpi xmlns:a14="http://schemas.microsoft.com/office/drawing/2010/main" val="0"/>
@@ -4119,7 +3894,7 @@
           <w:b/>
           <w:bCs/>
         </w:rPr>
-        <w:t>7</w:t>
+        <w:t>6</w:t>
       </w:r>
       <w:r>
         <w:rPr>
@@ -4129,10 +3904,7 @@
         <w:t>.</w:t>
       </w:r>
       <w:r>
-        <w:t xml:space="preserve"> </w:t>
-      </w:r>
-      <w:r>
-        <w:t>MPC zaman serisi, H2/CO oranı ve kontrol değişkenlerinin değişimi</w:t>
+        <w:t xml:space="preserve"> MPC zaman serisi, H2/CO oranı ve kontrol değişkenlerinin değişimi</w:t>
       </w:r>
     </w:p>
     <w:p>
@@ -4164,21 +3936,14 @@
           <w:b/>
           <w:bCs/>
         </w:rPr>
-        <w:t>8</w:t>
+        <w:t>7</w:t>
       </w:r>
       <w:r>
         <w:rPr>
           <w:b/>
           <w:bCs/>
         </w:rPr>
-        <w:t xml:space="preserve"> </w:t>
-      </w:r>
-      <w:r>
-        <w:rPr>
-          <w:b/>
-          <w:bCs/>
-        </w:rPr>
-        <w:t>Dönem içi çalışma sonuçları</w:t>
+        <w:t xml:space="preserve"> Dönem içi çalışma sonuçları</w:t>
       </w:r>
     </w:p>
     <w:p>
@@ -4218,7 +3983,7 @@
                     </pic:cNvPicPr>
                   </pic:nvPicPr>
                   <pic:blipFill rotWithShape="1">
-                    <a:blip r:embed="rId17" cstate="print">
+                    <a:blip r:embed="rId16" cstate="print">
                       <a:extLst>
                         <a:ext uri="{28A0092B-C50C-407E-A947-70E740481C1C}">
                           <a14:useLocalDpi xmlns:a14="http://schemas.microsoft.com/office/drawing/2010/main" val="0"/>
@@ -4293,13 +4058,17 @@
           <w:b/>
           <w:bCs/>
         </w:rPr>
-        <w:t>8.</w:t>
-      </w:r>
-      <w:r>
-        <w:t xml:space="preserve"> </w:t>
-      </w:r>
-      <w:r>
-        <w:t>TİK-5 döneminde geliştirilen soft-sensor, ileri surrogate model, optimizasyon ve MPC sisteminin nihai özet akışı</w:t>
+        <w:t>7</w:t>
+      </w:r>
+      <w:r>
+        <w:rPr>
+          <w:b/>
+          <w:bCs/>
+        </w:rPr>
+        <w:t>.</w:t>
+      </w:r>
+      <w:r>
+        <w:t xml:space="preserve"> TİK-5 döneminde geliştirilen soft-sensor, ileri surrogate model, optimizasyon ve MPC sisteminin nihai özet akışı</w:t>
       </w:r>
     </w:p>
     <w:p>
@@ -4327,6 +4096,19 @@
       </w:pPr>
       <w:r>
         <w:t>Statik optimizasyon çalışmaları, üç farklı biyoyağ tipi için başlangıçta yaklaşık 5.8-6.1 aralığında bulunan H2/CO oranının yaklaşık 2.5-2.8 aralığına indirilebildiğini göstermiştir. MPC senaryosu ise kompozisyon bozucu etkisi altında H2/CO oranının başlangıçtaki yüksek değerden hedef bölgeye yakın ve daha kararlı bir aralığa çekilebildiğini ortaya koymuştur. Bununla birlikte H2/CO = 2.0 hedefinin mevcut kontrol sınırları içinde tam olarak yakalanamaması, karar değişkeni sınırlarının, amaç fonksiyonu ağırlıklarının ve gerekirse ek kontrol değişkenlerinin sonraki dönemde daha ayrıntılı incelenmesi gerektiğini göstermektedir.</w:t>
+      </w:r>
+    </w:p>
+    <w:p>
+      <w:pPr>
+        <w:spacing w:before="240" w:after="240" w:line="360" w:lineRule="auto"/>
+        <w:jc w:val="both"/>
+      </w:pPr>
+      <w:r>
+        <w:t xml:space="preserve">Bu dönem elde edilen sonuçlar, deneysel olarak doğrulanmış nihai bir proses kontrol sistemi olarak değil, Cantera tabanlı simülasyon verisi üzerinde geliştirilen hesaplamalı bir tahmin-optimizasyon iş akışı olarak değerlendirilmelidir. Geliştirilen kapalı çevrim senaryo, tam </w:t>
+      </w:r>
+      <w:r>
+        <w:lastRenderedPageBreak/>
+        <w:t>dinamik MPC formülasyonu yerine soft-sensor, ileri surrogate model ve tekrarlı optimizasyon adımlarının birlikte çalışabilirliğini gösteren MPC-benzeri bir hesaplamalı örnektir. Optimizasyonda kullanılan maliyet terimi gerçek bir enerji veya ekonomik analiz olmayıp sıcaklık, basınç ve buhar/karbon oranına dayalı basitleştirilmiş normalize işletme cezasıdır. BiooilID bazlı ExtraTrees sonucu, nihai MLP soft-sensor modelinin doğrudan validasyonu olarak değil, ters tahmin probleminin yeni biyoyağ kompozisyonlarına karşı genelleme zorluğunu gösteren ek bir denetim olarak yorumlanmalıdır. Ayrıca ters tahmin problemi fiziksel olarak tekil bir çözüm garanti etmediğinden, benzer singaz kompozisyonlarının birden fazla biyoyağ bileşimine karşılık gelebileceği dikkate alınmalıdır. İleri surrogate modelin yüksek R2 değeri Cantera simülasyon veri uzayının başarılı biçimde yeniden üretildiğini göstermekte, ancak deneysel reaktör davranışının doğrudan doğrulanması anlamına gelmemektedir. Bu nedenle H2/CO oranına ek olarak tam gaz kompozisyonu, hidrojen üretimi, karbon içeren ürünler, gazın yaş/kuru baz tanımı ve optimum noktaların değişken sınırlarında bulunması gibi unsurlar nihai tez yazımında ayrıca tartışılacaktır.</w:t>
       </w:r>
     </w:p>
     <w:p>
@@ -4353,7 +4135,55 @@
         <w:jc w:val="both"/>
       </w:pPr>
       <w:r>
-        <w:t xml:space="preserve">Çalışmanın </w:t>
+        <w:t>Çalışmanın araştırma ve model geliştirme aşamaları bu dönem itibarıyla tamamlanmıştır. Önceki tez izleme dönemlerinde biyoyağ kompozisyonunun tahminine yönelik veri tabanı oluşturulmuş, veri ön işleme ve makine öğrenmesi modelleri geliştirilmiş, Cantera tabanlı reforming simülasyonları kullanılarak ters makine öğrenmesi modeli kurulmuş ve son dönemde bu model soft-sensor, optimizasyon ve model öngörülü kontrol yapısı içerisinde değerlendirilmiştir. Bu nedenle bir sonraki dönemde yeni bir model geliştirme veya yeni bir hesaplamalı senaryo oluşturma hedeflenmemektedir.</w:t>
+      </w:r>
+    </w:p>
+    <w:p>
+      <w:pPr>
+        <w:spacing w:before="240" w:after="240" w:line="360" w:lineRule="auto"/>
+        <w:jc w:val="both"/>
+      </w:pPr>
+      <w:r>
+        <w:t>Bir sonraki dönemde yapılacak temel çalışma, bugüne kadar tamamlanan tüm tez izleme raporlarının, üretilen veri setlerinin, yazılım çıktılarının, model performans sonuçlarının, optimizasyon/MPC senaryolarının, tablo ve figürlerin doktora tezi bütünlüğü içinde yeniden düzenlenmesidir. Bu kapsamda TİK-1 döneminde oluşturulan literatür ve problem tanımı, TİK-2 ve TİK-3 dönemlerinde geliştirilen veri işleme ve ilk makine öğrenmesi modelleri, TİK-4 döneminde geliştirilen Cantera tabanlı ters makine öğrenmesi modeli ve TİK-5 döneminde tamamlanan soft-sensor, ileri surrogate model, optimizasyon ve MPC çalışmaları tek bir tez akışı altında birleştirilecektir.</w:t>
+      </w:r>
+    </w:p>
+    <w:p>
+      <w:pPr>
+        <w:spacing w:before="240" w:after="240" w:line="360" w:lineRule="auto"/>
+        <w:jc w:val="both"/>
+      </w:pPr>
+      <w:r>
+        <w:t xml:space="preserve">Tez yazımında öncelikle giriş ve literatür bölümleri güncellenecek, ardından veri seti oluşturma, veri ön işleme, simülasyon altyapısı ve makine öğrenmesi yöntemleri ayrıntılı olarak </w:t>
+      </w:r>
+      <w:r>
+        <w:lastRenderedPageBreak/>
+        <w:t>yöntem bölümüne aktarılacaktır. Bulgular bölümünde önce biyoyağ kompozisyon tahmin modelleri, ardından ters makine öğrenmesi modeli, BiooilID bazlı validasyon, ileri surrogate model performansı, statik optimizasyon sonuçları ve MPC senaryosu sıralı olarak sunulacaktır. Sonuç bölümünde ise çalışmanın ana katkıları, modelin güçlü yönleri, sınırlılıkları ve gelecekte deneysel doğrulama/veri genişletme çalışmalarıyla nasıl ilerletilebileceği tartışılacaktır.</w:t>
+      </w:r>
+    </w:p>
+    <w:p>
+      <w:pPr>
+        <w:spacing w:before="240" w:after="240" w:line="360" w:lineRule="auto"/>
+        <w:jc w:val="both"/>
+      </w:pPr>
+      <w:r>
+        <w:t>Bu doğrultuda gelecek dönemin hedefi, tamamlanan bilimsel ve teknik çalışmaları doktora tezinin nihai metnine dönüştürmek, tablo ve figürleri tez formatına uygun hale getirmek, kaynakça ve biçimsel düzenlemeleri tamamlamak ve tezi savunmaya hazır hale getirmektir.</w:t>
+      </w:r>
+    </w:p>
+    <w:p>
+      <w:pPr>
+        <w:spacing w:before="240" w:after="240" w:line="360" w:lineRule="auto"/>
+        <w:jc w:val="both"/>
+        <w:rPr>
+          <w:b/>
+          <w:bCs/>
+        </w:rPr>
+      </w:pPr>
+      <w:r>
+        <w:rPr>
+          <w:b/>
+          <w:bCs/>
+        </w:rPr>
+        <w:t xml:space="preserve">B.4 Kaynaklar Dizini: </w:t>
       </w:r>
     </w:p>
     <w:p>
@@ -4361,17 +4191,28 @@
         <w:spacing w:before="240" w:after="240"/>
         <w:jc w:val="both"/>
         <w:rPr>
-          <w:b/>
-          <w:bCs/>
-        </w:rPr>
-      </w:pPr>
-      <w:r>
-        <w:rPr>
-          <w:b/>
-          <w:bCs/>
-        </w:rPr>
-        <w:lastRenderedPageBreak/>
-        <w:t xml:space="preserve">B.4 Kaynaklar Dizini: </w:t>
+          <w:lang w:val="en-US"/>
+        </w:rPr>
+      </w:pPr>
+      <w:r>
+        <w:rPr>
+          <w:lang w:val="en-US"/>
+        </w:rPr>
+        <w:t xml:space="preserve">Aniza, R., Chen, W., Yang, F., Pugazhendh, A., &amp; Singh, Y. </w:t>
+      </w:r>
+      <w:r>
+        <w:rPr>
+          <w:i/>
+          <w:iCs/>
+          <w:lang w:val="en-US"/>
+        </w:rPr>
+        <w:t>Integrating Taguchi method and artificial neural network for predicting and maximizing biofuel production via torrefaction and pyrolysis</w:t>
+      </w:r>
+      <w:r>
+        <w:rPr>
+          <w:lang w:val="en-US"/>
+        </w:rPr>
+        <w:t>. Bioresource Technology, 343 (2022): 126140.</w:t>
       </w:r>
     </w:p>
     <w:p>
@@ -4386,7 +4227,7 @@
         <w:rPr>
           <w:lang w:val="en-US"/>
         </w:rPr>
-        <w:t xml:space="preserve">Aniza, R., Chen, W., Yang, F., Pugazhendh, A., &amp; Singh, Y. </w:t>
+        <w:t xml:space="preserve">AspenTech. </w:t>
       </w:r>
       <w:r>
         <w:rPr>
@@ -4394,13 +4235,13 @@
           <w:iCs/>
           <w:lang w:val="en-US"/>
         </w:rPr>
-        <w:t>Integrating Taguchi method and artificial neural network for predicting and maximizing biofuel production via torrefaction and pyrolysis</w:t>
-      </w:r>
-      <w:r>
-        <w:rPr>
-          <w:lang w:val="en-US"/>
-        </w:rPr>
-        <w:t>. Bioresource Technology, 343 (2022): 126140.</w:t>
+        <w:t>Aspen Plus V12 Documentation</w:t>
+      </w:r>
+      <w:r>
+        <w:rPr>
+          <w:lang w:val="en-US"/>
+        </w:rPr>
+        <w:t>. AspenTech Technical Reference, 1 (2022): 1–1500.</w:t>
       </w:r>
     </w:p>
     <w:p>
@@ -4415,7 +4256,7 @@
         <w:rPr>
           <w:lang w:val="en-US"/>
         </w:rPr>
-        <w:t xml:space="preserve">AspenTech. </w:t>
+        <w:t xml:space="preserve">Azri Sukiran, M. M., Institusi, P., Baru Bangi, B., Mee Chin, C., &amp; Kartini Abu Bakar, N. </w:t>
       </w:r>
       <w:r>
         <w:rPr>
@@ -4423,13 +4264,13 @@
           <w:iCs/>
           <w:lang w:val="en-US"/>
         </w:rPr>
-        <w:t>Aspen Plus V12 Documentation</w:t>
-      </w:r>
-      <w:r>
-        <w:rPr>
-          <w:lang w:val="en-US"/>
-        </w:rPr>
-        <w:t>. AspenTech Technical Reference, 1 (2022): 1–1500.</w:t>
+        <w:t>Bio-oils from Pyrolysis of Oil Palm Empty Fruit Bunches</w:t>
+      </w:r>
+      <w:r>
+        <w:rPr>
+          <w:lang w:val="en-US"/>
+        </w:rPr>
+        <w:t>. American Journal of Applied Sciences, 6(5) (2009): 869–875.</w:t>
       </w:r>
     </w:p>
     <w:p>
@@ -4444,7 +4285,7 @@
         <w:rPr>
           <w:lang w:val="en-US"/>
         </w:rPr>
-        <w:t xml:space="preserve">Azri Sukiran, M. M., Institusi, P., Baru Bangi, B., Mee Chin, C., &amp; Kartini Abu Bakar, N. </w:t>
+        <w:t xml:space="preserve">Bekiroğulları, M., &amp; Kaya, M. </w:t>
       </w:r>
       <w:r>
         <w:rPr>
@@ -4452,13 +4293,13 @@
           <w:iCs/>
           <w:lang w:val="en-US"/>
         </w:rPr>
-        <w:t>Bio-oils from Pyrolysis of Oil Palm Empty Fruit Bunches</w:t>
-      </w:r>
-      <w:r>
-        <w:rPr>
-          <w:lang w:val="en-US"/>
-        </w:rPr>
-        <w:t>. American Journal of Applied Sciences, 6(5) (2009): 869–875.</w:t>
+        <w:t>Investigation of Hydrogen Production from Bio-Oil Substances Using Aspen Plus</w:t>
+      </w:r>
+      <w:r>
+        <w:rPr>
+          <w:lang w:val="en-US"/>
+        </w:rPr>
+        <w:t>. Gazi University Journal of Science, 33(1) (2020): 14–20.</w:t>
       </w:r>
     </w:p>
     <w:p>
@@ -4473,7 +4314,7 @@
         <w:rPr>
           <w:lang w:val="en-US"/>
         </w:rPr>
-        <w:t xml:space="preserve">Bekiroğulları, M., &amp; Kaya, M. </w:t>
+        <w:t xml:space="preserve">Bordoloi, N., Narzari, R., Sut, D., Saikia, R., Chutia, R. S., &amp; Kataki, R. </w:t>
       </w:r>
       <w:r>
         <w:rPr>
@@ -4481,35 +4322,6 @@
           <w:iCs/>
           <w:lang w:val="en-US"/>
         </w:rPr>
-        <w:t>Investigation of Hydrogen Production from Bio-Oil Substances Using Aspen Plus</w:t>
-      </w:r>
-      <w:r>
-        <w:rPr>
-          <w:lang w:val="en-US"/>
-        </w:rPr>
-        <w:t>. Gazi University Journal of Science, 33(1) (2020): 14–20.</w:t>
-      </w:r>
-    </w:p>
-    <w:p>
-      <w:pPr>
-        <w:spacing w:before="240" w:after="240"/>
-        <w:jc w:val="both"/>
-        <w:rPr>
-          <w:lang w:val="en-US"/>
-        </w:rPr>
-      </w:pPr>
-      <w:r>
-        <w:rPr>
-          <w:lang w:val="en-US"/>
-        </w:rPr>
-        <w:t xml:space="preserve">Bordoloi, N., Narzari, R., Sut, D., Saikia, R., Chutia, R. S., &amp; Kataki, R. </w:t>
-      </w:r>
-      <w:r>
-        <w:rPr>
-          <w:i/>
-          <w:iCs/>
-          <w:lang w:val="en-US"/>
-        </w:rPr>
         <w:t>Characterization of bio-oil and its sub-fractions from pyrolysis of Scenedesmus dimorphus</w:t>
       </w:r>
       <w:r>
@@ -4518,7 +4330,7 @@
         </w:rPr>
         <w:t xml:space="preserve">. Renewable Energy, 98 (2016): 245–253. </w:t>
       </w:r>
-      <w:hyperlink r:id="rId18">
+      <w:hyperlink r:id="rId17">
         <w:r>
           <w:rPr>
             <w:rStyle w:val="Kpr"/>
@@ -4629,7 +4441,7 @@
         </w:rPr>
         <w:t xml:space="preserve">. Fuel, 285 (2021). </w:t>
       </w:r>
-      <w:hyperlink r:id="rId19">
+      <w:hyperlink r:id="rId18">
         <w:r>
           <w:rPr>
             <w:rStyle w:val="Kpr"/>
@@ -4680,6 +4492,7 @@
         <w:rPr>
           <w:lang w:val="en-US"/>
         </w:rPr>
+        <w:lastRenderedPageBreak/>
         <w:t xml:space="preserve">Chen, D., Chen, X., Sun, J., Zheng, Z., &amp; Fu, K. </w:t>
       </w:r>
       <w:r>
@@ -4696,7 +4509,7 @@
         </w:rPr>
         <w:t xml:space="preserve">. Bioresource Technology, 216 (2016): 629–636. </w:t>
       </w:r>
-      <w:hyperlink r:id="rId20">
+      <w:hyperlink r:id="rId19">
         <w:r>
           <w:rPr>
             <w:rStyle w:val="Kpr"/>
@@ -4734,7 +4547,7 @@
         </w:rPr>
         <w:t xml:space="preserve">. Bioresource Technology, 233 (2017): 150–158. </w:t>
       </w:r>
-      <w:hyperlink r:id="rId21">
+      <w:hyperlink r:id="rId20">
         <w:r>
           <w:rPr>
             <w:rStyle w:val="Kpr"/>
@@ -4785,7 +4598,6 @@
         <w:rPr>
           <w:lang w:val="en-US"/>
         </w:rPr>
-        <w:lastRenderedPageBreak/>
         <w:t xml:space="preserve">Chen, W., Aniza, R., Arpia, A. A., Lo, H., Hoang, A. T., Goodarzi, V., &amp; Gao, J. </w:t>
       </w:r>
       <w:r>
@@ -4889,7 +4701,7 @@
         </w:rPr>
         <w:t xml:space="preserve">. Heliyon, 5(6) (2019): e01790. </w:t>
       </w:r>
-      <w:hyperlink r:id="rId22">
+      <w:hyperlink r:id="rId21">
         <w:r>
           <w:rPr>
             <w:rStyle w:val="Kpr"/>
@@ -5071,6 +4883,7 @@
         <w:rPr>
           <w:lang w:val="en-US"/>
         </w:rPr>
+        <w:lastRenderedPageBreak/>
         <w:t xml:space="preserve">Kartal, F., &amp; Özveren, U. </w:t>
       </w:r>
       <w:r>
@@ -5187,7 +5000,6 @@
         <w:rPr>
           <w:lang w:val="en-US"/>
         </w:rPr>
-        <w:lastRenderedPageBreak/>
         <w:t xml:space="preserve">Lee, H., &amp; Kim, Y. M. </w:t>
       </w:r>
       <w:r>
@@ -5334,7 +5146,7 @@
         </w:rPr>
         <w:t xml:space="preserve">. Waste Management, 158 (2023): 23–36. </w:t>
       </w:r>
-      <w:hyperlink r:id="rId23">
+      <w:hyperlink r:id="rId22">
         <w:r>
           <w:rPr>
             <w:rStyle w:val="Kpr"/>
@@ -5372,7 +5184,7 @@
         </w:rPr>
         <w:t xml:space="preserve">. Energy &amp; Fuels, 24(1) (2010): 699–706. </w:t>
       </w:r>
-      <w:hyperlink r:id="rId24">
+      <w:hyperlink r:id="rId23">
         <w:r>
           <w:rPr>
             <w:rStyle w:val="Kpr"/>
@@ -5496,6 +5308,7 @@
         <w:rPr>
           <w:lang w:val="en-US"/>
         </w:rPr>
+        <w:lastRenderedPageBreak/>
         <w:t xml:space="preserve">Pafili, A., Charisiou, N. D., Douvartzides, S. L., Siakavelas, G. I., Wang, W., Liu, G., Papadakis, V. G., &amp; Goula, M. A. (2021). Recent progress in the steam reforming of bio-oil for hydrogen production: A review of operating parameters, catalytic systems and technological innovations. In </w:t>
       </w:r>
       <w:r>
@@ -5541,7 +5354,7 @@
         </w:rPr>
         <w:t xml:space="preserve">. Journal of Analytical and Applied Pyrolysis, 186 (2025): 106919. </w:t>
       </w:r>
-      <w:hyperlink r:id="rId25">
+      <w:hyperlink r:id="rId24">
         <w:r>
           <w:rPr>
             <w:rStyle w:val="Kpr"/>
@@ -5621,7 +5434,6 @@
         <w:rPr>
           <w:lang w:val="en-US"/>
         </w:rPr>
-        <w:lastRenderedPageBreak/>
         <w:t xml:space="preserve">Smith, J., &amp; Brown, P. </w:t>
       </w:r>
       <w:r>
@@ -5784,7 +5596,7 @@
         </w:rPr>
         <w:t xml:space="preserve">. Bioresource Technology, 268 (2018): 323–331. </w:t>
       </w:r>
-      <w:hyperlink r:id="rId26">
+      <w:hyperlink r:id="rId25">
         <w:r>
           <w:rPr>
             <w:rStyle w:val="Kpr"/>
@@ -5879,6 +5691,7 @@
         <w:rPr>
           <w:lang w:val="en-US"/>
         </w:rPr>
+        <w:lastRenderedPageBreak/>
         <w:t xml:space="preserve">Yang, Y., &amp; Xu, X. </w:t>
       </w:r>
       <w:r>
@@ -6010,7 +5823,6 @@
         <w:rPr>
           <w:lang w:val="en-US"/>
         </w:rPr>
-        <w:lastRenderedPageBreak/>
         <w:t xml:space="preserve">Zhu, Z., Toor, S. S., Rosendahl, L., Yu, D. H., &amp; Chen, G. Y. </w:t>
       </w:r>
       <w:r>
@@ -6592,7 +6404,7 @@
   <w:style w:type="paragraph" w:default="1" w:styleId="Normal">
     <w:name w:val="Normal"/>
     <w:qFormat/>
-    <w:rsid w:val="00EF1C17"/>
+    <w:rsid w:val="00E4691E"/>
     <w:rPr>
       <w:sz w:val="24"/>
       <w:szCs w:val="24"/>

</xml_diff>